<commit_message>
refactoring day01_prise en main openvla
</commit_message>
<xml_diff>
--- a/OpenVLA_prise_en_main.docx
+++ b/OpenVLA_prise_en_main.docx
@@ -1951,1224 +1951,364 @@
     <w:p>
       <w:pPr>
         <w:pStyle w:val="Heading1"/>
-        <w:spacing w:before="0" w:line="240" w:lineRule="auto"/>
-        <w:rPr>
-          <w:rFonts w:cstheme="majorHAnsi"/>
-          <w:sz w:val="22"/>
-          <w:szCs w:val="22"/>
-          <w:lang w:val="fr-CA"/>
-        </w:rPr>
       </w:pPr>
       <w:r>
-        <w:rPr>
-          <w:rFonts w:ascii="Apple Color Emoji" w:hAnsi="Apple Color Emoji" w:cs="Apple Color Emoji"/>
-          <w:sz w:val="22"/>
-          <w:szCs w:val="22"/>
-        </w:rPr>
-        <w:t>🔧</w:t>
-      </w:r>
-      <w:r>
-        <w:rPr>
-          <w:rFonts w:cstheme="majorHAnsi"/>
-          <w:sz w:val="22"/>
-          <w:szCs w:val="22"/>
-          <w:lang w:val="fr-CA"/>
-        </w:rPr>
-        <w:t xml:space="preserve"> </w:t>
-      </w:r>
-      <w:r>
-        <w:rPr>
-          <w:rStyle w:val="Strong"/>
-          <w:rFonts w:cstheme="majorHAnsi"/>
-          <w:b/>
-          <w:bCs/>
-          <w:sz w:val="22"/>
-          <w:szCs w:val="22"/>
-          <w:lang w:val="fr-CA"/>
-        </w:rPr>
-        <w:t xml:space="preserve">Installer </w:t>
-      </w:r>
-      <w:proofErr w:type="spellStart"/>
-      <w:r>
-        <w:rPr>
-          <w:rStyle w:val="Strong"/>
-          <w:rFonts w:cstheme="majorHAnsi"/>
-          <w:b/>
-          <w:bCs/>
-          <w:sz w:val="22"/>
-          <w:szCs w:val="22"/>
-          <w:lang w:val="fr-CA"/>
-        </w:rPr>
-        <w:t>OpenVLA</w:t>
-      </w:r>
-      <w:proofErr w:type="spellEnd"/>
-      <w:r>
-        <w:rPr>
-          <w:rStyle w:val="Strong"/>
-          <w:rFonts w:cstheme="majorHAnsi"/>
-          <w:b/>
-          <w:bCs/>
-          <w:sz w:val="22"/>
-          <w:szCs w:val="22"/>
-          <w:lang w:val="fr-CA"/>
-        </w:rPr>
-        <w:t xml:space="preserve"> FP16 — Les étapes essentielles</w:t>
+        <w:t>🔧 Installer openvla-7b sous Windows 11 Pro — Les étapes essentielles</w:t>
       </w:r>
     </w:p>
     <w:p>
       <w:pPr>
         <w:pStyle w:val="Heading2"/>
-        <w:spacing w:before="0" w:line="240" w:lineRule="auto"/>
-        <w:rPr>
-          <w:rFonts w:cstheme="majorHAnsi"/>
-          <w:sz w:val="22"/>
-          <w:szCs w:val="22"/>
-        </w:rPr>
       </w:pPr>
       <w:r>
-        <w:rPr>
-          <w:rStyle w:val="Strong"/>
-          <w:rFonts w:cstheme="majorHAnsi"/>
-          <w:b/>
-          <w:bCs/>
-          <w:sz w:val="22"/>
-          <w:szCs w:val="22"/>
-        </w:rPr>
-        <w:t xml:space="preserve">1) </w:t>
-      </w:r>
-      <w:proofErr w:type="spellStart"/>
-      <w:r>
-        <w:rPr>
-          <w:rStyle w:val="Strong"/>
-          <w:rFonts w:cstheme="majorHAnsi"/>
-          <w:b/>
-          <w:bCs/>
-          <w:sz w:val="22"/>
-          <w:szCs w:val="22"/>
-        </w:rPr>
-        <w:t>Préparer</w:t>
-      </w:r>
-      <w:proofErr w:type="spellEnd"/>
-      <w:r>
-        <w:rPr>
-          <w:rStyle w:val="Strong"/>
-          <w:rFonts w:cstheme="majorHAnsi"/>
-          <w:b/>
-          <w:bCs/>
-          <w:sz w:val="22"/>
-          <w:szCs w:val="22"/>
-        </w:rPr>
-        <w:t xml:space="preserve"> la machine</w:t>
+        <w:t>1) Préparer la machine</w:t>
       </w:r>
     </w:p>
     <w:p>
       <w:pPr>
-        <w:pStyle w:val="NormalWeb"/>
-        <w:numPr>
-          <w:ilvl w:val="0"/>
-          <w:numId w:val="10"/>
-        </w:numPr>
-        <w:spacing w:before="0" w:beforeAutospacing="0"/>
-        <w:rPr>
-          <w:rFonts w:asciiTheme="majorHAnsi" w:hAnsiTheme="majorHAnsi" w:cstheme="majorHAnsi"/>
-          <w:sz w:val="22"/>
-          <w:szCs w:val="22"/>
-        </w:rPr>
+        <w:pStyle w:val="ListBullet"/>
       </w:pPr>
-      <w:proofErr w:type="spellStart"/>
       <w:r>
-        <w:rPr>
-          <w:rFonts w:asciiTheme="majorHAnsi" w:hAnsiTheme="majorHAnsi" w:cstheme="majorHAnsi"/>
-          <w:sz w:val="22"/>
-          <w:szCs w:val="22"/>
-        </w:rPr>
-        <w:t>Avoir</w:t>
-      </w:r>
-      <w:proofErr w:type="spellEnd"/>
-      <w:r>
-        <w:rPr>
-          <w:rFonts w:asciiTheme="majorHAnsi" w:hAnsiTheme="majorHAnsi" w:cstheme="majorHAnsi"/>
-          <w:sz w:val="22"/>
-          <w:szCs w:val="22"/>
-        </w:rPr>
-        <w:t xml:space="preserve"> </w:t>
-      </w:r>
-      <w:r>
-        <w:rPr>
-          <w:rStyle w:val="Strong"/>
-          <w:rFonts w:asciiTheme="majorHAnsi" w:hAnsiTheme="majorHAnsi" w:cstheme="majorHAnsi"/>
-          <w:sz w:val="22"/>
-          <w:szCs w:val="22"/>
-        </w:rPr>
-        <w:t>Ubuntu 20.04/22.04</w:t>
+        <w:t>Windows 11 Pro, GPU NVIDIA (≥ 16 Go VRAM recommandé pour FP16).</w:t>
       </w:r>
     </w:p>
     <w:p>
       <w:pPr>
-        <w:pStyle w:val="NormalWeb"/>
-        <w:numPr>
-          <w:ilvl w:val="0"/>
-          <w:numId w:val="10"/>
-        </w:numPr>
-        <w:spacing w:before="0" w:beforeAutospacing="0"/>
-        <w:rPr>
-          <w:rFonts w:asciiTheme="majorHAnsi" w:hAnsiTheme="majorHAnsi" w:cstheme="majorHAnsi"/>
-          <w:sz w:val="22"/>
-          <w:szCs w:val="22"/>
-          <w:lang w:val="fr-CA"/>
-        </w:rPr>
+        <w:pStyle w:val="ListBullet"/>
       </w:pPr>
       <w:r>
-        <w:rPr>
-          <w:rFonts w:asciiTheme="majorHAnsi" w:hAnsiTheme="majorHAnsi" w:cstheme="majorHAnsi"/>
-          <w:sz w:val="22"/>
-          <w:szCs w:val="22"/>
-          <w:lang w:val="fr-CA"/>
-        </w:rPr>
-        <w:t xml:space="preserve">Avoir un </w:t>
-      </w:r>
-      <w:r>
-        <w:rPr>
-          <w:rStyle w:val="Strong"/>
-          <w:rFonts w:asciiTheme="majorHAnsi" w:hAnsiTheme="majorHAnsi" w:cstheme="majorHAnsi"/>
-          <w:sz w:val="22"/>
-          <w:szCs w:val="22"/>
-          <w:lang w:val="fr-CA"/>
-        </w:rPr>
-        <w:t>GPU NVIDIA (≥ 8 Go VRAM)</w:t>
+        <w:t>Miniconda ou Anaconda installé.</w:t>
       </w:r>
     </w:p>
     <w:p>
       <w:pPr>
-        <w:pStyle w:val="NormalWeb"/>
-        <w:numPr>
-          <w:ilvl w:val="0"/>
-          <w:numId w:val="10"/>
-        </w:numPr>
-        <w:spacing w:before="0" w:beforeAutospacing="0" w:after="0" w:afterAutospacing="0"/>
-        <w:rPr>
-          <w:rFonts w:asciiTheme="majorHAnsi" w:hAnsiTheme="majorHAnsi" w:cstheme="majorHAnsi"/>
-          <w:sz w:val="22"/>
-          <w:szCs w:val="22"/>
-          <w:lang w:val="fr-CA"/>
-        </w:rPr>
+        <w:pStyle w:val="ListBullet"/>
       </w:pPr>
       <w:r>
-        <w:rPr>
-          <w:rFonts w:asciiTheme="majorHAnsi" w:hAnsiTheme="majorHAnsi" w:cstheme="majorHAnsi"/>
-          <w:sz w:val="22"/>
-          <w:szCs w:val="22"/>
-          <w:lang w:val="fr-CA"/>
-        </w:rPr>
-        <w:t>Installer les outils de base :</w:t>
+        <w:t>Python 3.11 — version stable utilisée sur le poste de stage.</w:t>
       </w:r>
     </w:p>
     <w:p>
       <w:pPr>
-        <w:spacing w:afterAutospacing="1" w:line="240" w:lineRule="auto"/>
-        <w:jc w:val="right"/>
-        <w:rPr>
-          <w:rStyle w:val="HTMLCode"/>
-          <w:rFonts w:asciiTheme="majorHAnsi" w:eastAsiaTheme="minorEastAsia" w:hAnsiTheme="majorHAnsi" w:cstheme="majorHAnsi"/>
-          <w:i/>
-          <w:iCs/>
-          <w:sz w:val="22"/>
-          <w:szCs w:val="22"/>
-          <w:lang w:val="en-CA"/>
-        </w:rPr>
-      </w:pPr>
-      <w:proofErr w:type="spellStart"/>
-      <w:r>
-        <w:rPr>
-          <w:rStyle w:val="HTMLCode"/>
-          <w:rFonts w:asciiTheme="majorHAnsi" w:eastAsiaTheme="minorEastAsia" w:hAnsiTheme="majorHAnsi" w:cstheme="majorHAnsi"/>
-          <w:i/>
-          <w:iCs/>
-          <w:sz w:val="22"/>
-          <w:szCs w:val="22"/>
-          <w:lang w:val="en-CA"/>
-        </w:rPr>
-        <w:t>sudo</w:t>
-      </w:r>
-      <w:proofErr w:type="spellEnd"/>
-      <w:r>
-        <w:rPr>
-          <w:rStyle w:val="HTMLCode"/>
-          <w:rFonts w:asciiTheme="majorHAnsi" w:eastAsiaTheme="minorEastAsia" w:hAnsiTheme="majorHAnsi" w:cstheme="majorHAnsi"/>
-          <w:i/>
-          <w:iCs/>
-          <w:sz w:val="22"/>
-          <w:szCs w:val="22"/>
-          <w:lang w:val="en-CA"/>
-        </w:rPr>
-        <w:t xml:space="preserve"> apt update &amp;&amp; </w:t>
-      </w:r>
-      <w:proofErr w:type="spellStart"/>
-      <w:r>
-        <w:rPr>
-          <w:rStyle w:val="HTMLCode"/>
-          <w:rFonts w:asciiTheme="majorHAnsi" w:eastAsiaTheme="minorEastAsia" w:hAnsiTheme="majorHAnsi" w:cstheme="majorHAnsi"/>
-          <w:i/>
-          <w:iCs/>
-          <w:sz w:val="22"/>
-          <w:szCs w:val="22"/>
-          <w:lang w:val="en-CA"/>
-        </w:rPr>
-        <w:t>sudo</w:t>
-      </w:r>
-      <w:proofErr w:type="spellEnd"/>
-      <w:r>
-        <w:rPr>
-          <w:rStyle w:val="HTMLCode"/>
-          <w:rFonts w:asciiTheme="majorHAnsi" w:eastAsiaTheme="minorEastAsia" w:hAnsiTheme="majorHAnsi" w:cstheme="majorHAnsi"/>
-          <w:i/>
-          <w:iCs/>
-          <w:sz w:val="22"/>
-          <w:szCs w:val="22"/>
-          <w:lang w:val="en-CA"/>
-        </w:rPr>
-        <w:t xml:space="preserve"> apt install -y git python3 python3-venv python3-pip </w:t>
-      </w:r>
-      <w:proofErr w:type="spellStart"/>
-      <w:r>
-        <w:rPr>
-          <w:rStyle w:val="HTMLCode"/>
-          <w:rFonts w:asciiTheme="majorHAnsi" w:eastAsiaTheme="minorEastAsia" w:hAnsiTheme="majorHAnsi" w:cstheme="majorHAnsi"/>
-          <w:i/>
-          <w:iCs/>
-          <w:sz w:val="22"/>
-          <w:szCs w:val="22"/>
-          <w:lang w:val="en-CA"/>
-        </w:rPr>
-        <w:t>ffmpeg</w:t>
-      </w:r>
-      <w:proofErr w:type="spellEnd"/>
-    </w:p>
-    <w:p>
-      <w:pPr>
-        <w:pStyle w:val="Heading2"/>
-        <w:spacing w:before="0" w:line="240" w:lineRule="auto"/>
-        <w:rPr>
-          <w:rFonts w:cstheme="majorHAnsi"/>
-          <w:sz w:val="22"/>
-          <w:szCs w:val="22"/>
-          <w:lang w:val="fr-CA"/>
-        </w:rPr>
+        <w:pStyle w:val="ListBullet"/>
       </w:pPr>
       <w:r>
-        <w:rPr>
-          <w:rStyle w:val="Strong"/>
-          <w:rFonts w:cstheme="majorHAnsi"/>
-          <w:b/>
-          <w:bCs/>
-          <w:sz w:val="22"/>
-          <w:szCs w:val="22"/>
-          <w:lang w:val="fr-CA"/>
-        </w:rPr>
-        <w:t>2) Créer l’environnement Python</w:t>
-      </w:r>
-    </w:p>
-    <w:p>
-      <w:pPr>
-        <w:pStyle w:val="HTMLPreformatted"/>
-        <w:jc w:val="right"/>
-        <w:rPr>
-          <w:rStyle w:val="HTMLCode"/>
-          <w:rFonts w:asciiTheme="majorHAnsi" w:hAnsiTheme="majorHAnsi" w:cstheme="majorHAnsi"/>
-          <w:i/>
-          <w:iCs/>
-          <w:sz w:val="22"/>
-          <w:szCs w:val="22"/>
-          <w:lang w:val="fr-CA"/>
-        </w:rPr>
-      </w:pPr>
-      <w:proofErr w:type="gramStart"/>
-      <w:r>
-        <w:rPr>
-          <w:rStyle w:val="HTMLCode"/>
-          <w:rFonts w:asciiTheme="majorHAnsi" w:hAnsiTheme="majorHAnsi" w:cstheme="majorHAnsi"/>
-          <w:i/>
-          <w:iCs/>
-          <w:sz w:val="22"/>
-          <w:szCs w:val="22"/>
-          <w:lang w:val="fr-CA"/>
-        </w:rPr>
-        <w:t>python</w:t>
-      </w:r>
-      <w:proofErr w:type="gramEnd"/>
-      <w:r>
-        <w:rPr>
-          <w:rStyle w:val="HTMLCode"/>
-          <w:rFonts w:asciiTheme="majorHAnsi" w:hAnsiTheme="majorHAnsi" w:cstheme="majorHAnsi"/>
-          <w:i/>
-          <w:iCs/>
-          <w:sz w:val="22"/>
-          <w:szCs w:val="22"/>
-          <w:lang w:val="fr-CA"/>
-        </w:rPr>
-        <w:t xml:space="preserve">3 -m </w:t>
-      </w:r>
-      <w:proofErr w:type="spellStart"/>
-      <w:r>
-        <w:rPr>
-          <w:rStyle w:val="HTMLCode"/>
-          <w:rFonts w:asciiTheme="majorHAnsi" w:hAnsiTheme="majorHAnsi" w:cstheme="majorHAnsi"/>
-          <w:i/>
-          <w:iCs/>
-          <w:sz w:val="22"/>
-          <w:szCs w:val="22"/>
-          <w:lang w:val="fr-CA"/>
-        </w:rPr>
-        <w:t>venv</w:t>
-      </w:r>
-      <w:proofErr w:type="spellEnd"/>
-      <w:r>
-        <w:rPr>
-          <w:rStyle w:val="HTMLCode"/>
-          <w:rFonts w:asciiTheme="majorHAnsi" w:hAnsiTheme="majorHAnsi" w:cstheme="majorHAnsi"/>
-          <w:i/>
-          <w:iCs/>
-          <w:sz w:val="22"/>
-          <w:szCs w:val="22"/>
-          <w:lang w:val="fr-CA"/>
-        </w:rPr>
-        <w:t xml:space="preserve"> </w:t>
-      </w:r>
-      <w:proofErr w:type="spellStart"/>
-      <w:r>
-        <w:rPr>
-          <w:rStyle w:val="HTMLCode"/>
-          <w:rFonts w:asciiTheme="majorHAnsi" w:hAnsiTheme="majorHAnsi" w:cstheme="majorHAnsi"/>
-          <w:i/>
-          <w:iCs/>
-          <w:sz w:val="22"/>
-          <w:szCs w:val="22"/>
-          <w:lang w:val="fr-CA"/>
-        </w:rPr>
-        <w:t>openvla_env</w:t>
-      </w:r>
-      <w:proofErr w:type="spellEnd"/>
-    </w:p>
-    <w:p>
-      <w:pPr>
-        <w:pStyle w:val="HTMLPreformatted"/>
-        <w:jc w:val="right"/>
-        <w:rPr>
-          <w:rStyle w:val="HTMLCode"/>
-          <w:rFonts w:asciiTheme="majorHAnsi" w:hAnsiTheme="majorHAnsi" w:cstheme="majorHAnsi"/>
-          <w:i/>
-          <w:iCs/>
-          <w:sz w:val="22"/>
-          <w:szCs w:val="22"/>
-          <w:lang w:val="fr-CA"/>
-        </w:rPr>
-      </w:pPr>
-      <w:proofErr w:type="gramStart"/>
-      <w:r>
-        <w:rPr>
-          <w:rStyle w:val="HTMLCode"/>
-          <w:rFonts w:asciiTheme="majorHAnsi" w:hAnsiTheme="majorHAnsi" w:cstheme="majorHAnsi"/>
-          <w:i/>
-          <w:iCs/>
-          <w:sz w:val="22"/>
-          <w:szCs w:val="22"/>
-          <w:lang w:val="fr-CA"/>
-        </w:rPr>
-        <w:t>source</w:t>
-      </w:r>
-      <w:proofErr w:type="gramEnd"/>
-      <w:r>
-        <w:rPr>
-          <w:rStyle w:val="HTMLCode"/>
-          <w:rFonts w:asciiTheme="majorHAnsi" w:hAnsiTheme="majorHAnsi" w:cstheme="majorHAnsi"/>
-          <w:i/>
-          <w:iCs/>
-          <w:sz w:val="22"/>
-          <w:szCs w:val="22"/>
-          <w:lang w:val="fr-CA"/>
-        </w:rPr>
-        <w:t xml:space="preserve"> </w:t>
-      </w:r>
-      <w:proofErr w:type="spellStart"/>
-      <w:r>
-        <w:rPr>
-          <w:rStyle w:val="HTMLCode"/>
-          <w:rFonts w:asciiTheme="majorHAnsi" w:hAnsiTheme="majorHAnsi" w:cstheme="majorHAnsi"/>
-          <w:i/>
-          <w:iCs/>
-          <w:sz w:val="22"/>
-          <w:szCs w:val="22"/>
-          <w:lang w:val="fr-CA"/>
-        </w:rPr>
-        <w:t>openvla_env</w:t>
-      </w:r>
-      <w:proofErr w:type="spellEnd"/>
-      <w:r>
-        <w:rPr>
-          <w:rStyle w:val="HTMLCode"/>
-          <w:rFonts w:asciiTheme="majorHAnsi" w:hAnsiTheme="majorHAnsi" w:cstheme="majorHAnsi"/>
-          <w:i/>
-          <w:iCs/>
-          <w:sz w:val="22"/>
-          <w:szCs w:val="22"/>
-          <w:lang w:val="fr-CA"/>
-        </w:rPr>
-        <w:t>/bin/</w:t>
-      </w:r>
-      <w:proofErr w:type="spellStart"/>
-      <w:r>
-        <w:rPr>
-          <w:rStyle w:val="HTMLCode"/>
-          <w:rFonts w:asciiTheme="majorHAnsi" w:hAnsiTheme="majorHAnsi" w:cstheme="majorHAnsi"/>
-          <w:i/>
-          <w:iCs/>
-          <w:sz w:val="22"/>
-          <w:szCs w:val="22"/>
-          <w:lang w:val="fr-CA"/>
-        </w:rPr>
-        <w:t>activate</w:t>
-      </w:r>
-      <w:proofErr w:type="spellEnd"/>
-    </w:p>
-    <w:p>
-      <w:pPr>
-        <w:pStyle w:val="Heading2"/>
-        <w:spacing w:before="0" w:line="240" w:lineRule="auto"/>
-        <w:rPr>
-          <w:rFonts w:cstheme="majorHAnsi"/>
-          <w:sz w:val="22"/>
-          <w:szCs w:val="22"/>
-          <w:lang w:val="fr-CA"/>
-        </w:rPr>
-      </w:pPr>
-      <w:r>
-        <w:rPr>
-          <w:rStyle w:val="Strong"/>
-          <w:rFonts w:cstheme="majorHAnsi"/>
-          <w:b/>
-          <w:bCs/>
-          <w:sz w:val="22"/>
-          <w:szCs w:val="22"/>
-          <w:lang w:val="fr-CA"/>
-        </w:rPr>
-        <w:t xml:space="preserve">3) Installer </w:t>
-      </w:r>
-      <w:proofErr w:type="spellStart"/>
-      <w:r>
-        <w:rPr>
-          <w:rStyle w:val="Strong"/>
-          <w:rFonts w:cstheme="majorHAnsi"/>
-          <w:b/>
-          <w:bCs/>
-          <w:sz w:val="22"/>
-          <w:szCs w:val="22"/>
-          <w:lang w:val="fr-CA"/>
-        </w:rPr>
-        <w:t>PyTorch</w:t>
-      </w:r>
-      <w:proofErr w:type="spellEnd"/>
-      <w:r>
-        <w:rPr>
-          <w:rStyle w:val="Strong"/>
-          <w:rFonts w:cstheme="majorHAnsi"/>
-          <w:b/>
-          <w:bCs/>
-          <w:sz w:val="22"/>
-          <w:szCs w:val="22"/>
-          <w:lang w:val="fr-CA"/>
-        </w:rPr>
-        <w:t xml:space="preserve"> GPU (CUDA)</w:t>
-      </w:r>
-    </w:p>
-    <w:p>
-      <w:pPr>
-        <w:pStyle w:val="HTMLPreformatted"/>
-        <w:jc w:val="right"/>
-        <w:rPr>
-          <w:rStyle w:val="HTMLCode"/>
-          <w:rFonts w:asciiTheme="majorHAnsi" w:hAnsiTheme="majorHAnsi" w:cstheme="majorHAnsi"/>
-          <w:i/>
-          <w:iCs/>
-          <w:sz w:val="22"/>
-          <w:szCs w:val="22"/>
-        </w:rPr>
-      </w:pPr>
-      <w:r>
-        <w:rPr>
-          <w:rStyle w:val="HTMLCode"/>
-          <w:rFonts w:asciiTheme="majorHAnsi" w:hAnsiTheme="majorHAnsi" w:cstheme="majorHAnsi"/>
-          <w:sz w:val="22"/>
-          <w:szCs w:val="22"/>
-          <w:lang w:val="fr-CA"/>
-        </w:rPr>
-        <w:tab/>
-      </w:r>
-      <w:r>
-        <w:rPr>
-          <w:rStyle w:val="HTMLCode"/>
-          <w:rFonts w:asciiTheme="majorHAnsi" w:hAnsiTheme="majorHAnsi" w:cstheme="majorHAnsi"/>
-          <w:i/>
-          <w:iCs/>
-          <w:sz w:val="22"/>
-          <w:szCs w:val="22"/>
-        </w:rPr>
-        <w:t xml:space="preserve">pip install torch </w:t>
-      </w:r>
-      <w:proofErr w:type="spellStart"/>
-      <w:r>
-        <w:rPr>
-          <w:rStyle w:val="HTMLCode"/>
-          <w:rFonts w:asciiTheme="majorHAnsi" w:hAnsiTheme="majorHAnsi" w:cstheme="majorHAnsi"/>
-          <w:i/>
-          <w:iCs/>
-          <w:sz w:val="22"/>
-          <w:szCs w:val="22"/>
-        </w:rPr>
-        <w:t>torchvision</w:t>
-      </w:r>
-      <w:proofErr w:type="spellEnd"/>
-      <w:r>
-        <w:rPr>
-          <w:rStyle w:val="HTMLCode"/>
-          <w:rFonts w:asciiTheme="majorHAnsi" w:hAnsiTheme="majorHAnsi" w:cstheme="majorHAnsi"/>
-          <w:i/>
-          <w:iCs/>
-          <w:sz w:val="22"/>
-          <w:szCs w:val="22"/>
-        </w:rPr>
-        <w:t xml:space="preserve"> --index-</w:t>
-      </w:r>
-      <w:proofErr w:type="spellStart"/>
-      <w:r>
-        <w:rPr>
-          <w:rStyle w:val="HTMLCode"/>
-          <w:rFonts w:asciiTheme="majorHAnsi" w:hAnsiTheme="majorHAnsi" w:cstheme="majorHAnsi"/>
-          <w:i/>
-          <w:iCs/>
-          <w:sz w:val="22"/>
-          <w:szCs w:val="22"/>
-        </w:rPr>
-        <w:t>url</w:t>
-      </w:r>
-      <w:proofErr w:type="spellEnd"/>
-      <w:r>
-        <w:rPr>
-          <w:rStyle w:val="HTMLCode"/>
-          <w:rFonts w:asciiTheme="majorHAnsi" w:hAnsiTheme="majorHAnsi" w:cstheme="majorHAnsi"/>
-          <w:i/>
-          <w:iCs/>
-          <w:sz w:val="22"/>
-          <w:szCs w:val="22"/>
-        </w:rPr>
-        <w:t xml:space="preserve"> https://download.pytorch.org/whl/cu118</w:t>
-      </w:r>
-    </w:p>
-    <w:p>
-      <w:pPr>
-        <w:pStyle w:val="HTMLPreformatted"/>
-        <w:jc w:val="right"/>
-        <w:rPr>
-          <w:rStyle w:val="HTMLCode"/>
-          <w:rFonts w:asciiTheme="majorHAnsi" w:hAnsiTheme="majorHAnsi" w:cstheme="majorHAnsi"/>
-          <w:i/>
-          <w:iCs/>
-          <w:sz w:val="22"/>
-          <w:szCs w:val="22"/>
-        </w:rPr>
-      </w:pPr>
-    </w:p>
-    <w:p>
-      <w:pPr>
-        <w:pStyle w:val="Heading2"/>
-        <w:spacing w:before="0" w:line="240" w:lineRule="auto"/>
-        <w:rPr>
-          <w:rFonts w:cstheme="majorHAnsi"/>
-          <w:sz w:val="22"/>
-          <w:szCs w:val="22"/>
-          <w:lang w:val="fr-CA"/>
-        </w:rPr>
-      </w:pPr>
-      <w:r>
-        <w:rPr>
-          <w:rStyle w:val="Strong"/>
-          <w:rFonts w:cstheme="majorHAnsi"/>
-          <w:b/>
-          <w:bCs/>
-          <w:sz w:val="22"/>
-          <w:szCs w:val="22"/>
-          <w:lang w:val="fr-CA"/>
-        </w:rPr>
-        <w:t xml:space="preserve">4) Télécharger </w:t>
-      </w:r>
-      <w:proofErr w:type="spellStart"/>
-      <w:r>
-        <w:rPr>
-          <w:rStyle w:val="Strong"/>
-          <w:rFonts w:cstheme="majorHAnsi"/>
-          <w:b/>
-          <w:bCs/>
-          <w:sz w:val="22"/>
-          <w:szCs w:val="22"/>
-          <w:lang w:val="fr-CA"/>
-        </w:rPr>
-        <w:t>OpenVLA</w:t>
-      </w:r>
-      <w:proofErr w:type="spellEnd"/>
-    </w:p>
-    <w:p>
-      <w:pPr>
-        <w:pStyle w:val="HTMLPreformatted"/>
-        <w:jc w:val="right"/>
-        <w:rPr>
-          <w:rStyle w:val="HTMLCode"/>
-          <w:rFonts w:asciiTheme="majorHAnsi" w:hAnsiTheme="majorHAnsi" w:cstheme="majorHAnsi"/>
-          <w:i/>
-          <w:iCs/>
-          <w:sz w:val="22"/>
-          <w:szCs w:val="22"/>
-          <w:lang w:val="fr-CA"/>
-        </w:rPr>
-      </w:pPr>
-      <w:proofErr w:type="gramStart"/>
-      <w:r>
-        <w:rPr>
-          <w:rStyle w:val="HTMLCode"/>
-          <w:rFonts w:asciiTheme="majorHAnsi" w:hAnsiTheme="majorHAnsi" w:cstheme="majorHAnsi"/>
-          <w:i/>
-          <w:iCs/>
-          <w:sz w:val="22"/>
-          <w:szCs w:val="22"/>
-          <w:lang w:val="fr-CA"/>
-        </w:rPr>
-        <w:t>git</w:t>
-      </w:r>
-      <w:proofErr w:type="gramEnd"/>
-      <w:r>
-        <w:rPr>
-          <w:rStyle w:val="HTMLCode"/>
-          <w:rFonts w:asciiTheme="majorHAnsi" w:hAnsiTheme="majorHAnsi" w:cstheme="majorHAnsi"/>
-          <w:i/>
-          <w:iCs/>
-          <w:sz w:val="22"/>
-          <w:szCs w:val="22"/>
-          <w:lang w:val="fr-CA"/>
-        </w:rPr>
-        <w:t xml:space="preserve"> clone https://github.com/openvla/openvla.git</w:t>
-      </w:r>
-    </w:p>
-    <w:p>
-      <w:pPr>
-        <w:pStyle w:val="HTMLPreformatted"/>
-        <w:jc w:val="right"/>
-        <w:rPr>
-          <w:rStyle w:val="HTMLCode"/>
-          <w:rFonts w:asciiTheme="majorHAnsi" w:hAnsiTheme="majorHAnsi" w:cstheme="majorHAnsi"/>
-          <w:i/>
-          <w:iCs/>
-          <w:sz w:val="22"/>
-          <w:szCs w:val="22"/>
-          <w:lang w:val="fr-CA"/>
-        </w:rPr>
-      </w:pPr>
-      <w:proofErr w:type="gramStart"/>
-      <w:r>
-        <w:rPr>
-          <w:rStyle w:val="HTMLCode"/>
-          <w:rFonts w:asciiTheme="majorHAnsi" w:hAnsiTheme="majorHAnsi" w:cstheme="majorHAnsi"/>
-          <w:i/>
-          <w:iCs/>
-          <w:sz w:val="22"/>
-          <w:szCs w:val="22"/>
-          <w:lang w:val="fr-CA"/>
-        </w:rPr>
-        <w:t>cd</w:t>
-      </w:r>
-      <w:proofErr w:type="gramEnd"/>
-      <w:r>
-        <w:rPr>
-          <w:rStyle w:val="HTMLCode"/>
-          <w:rFonts w:asciiTheme="majorHAnsi" w:hAnsiTheme="majorHAnsi" w:cstheme="majorHAnsi"/>
-          <w:i/>
-          <w:iCs/>
-          <w:sz w:val="22"/>
-          <w:szCs w:val="22"/>
-          <w:lang w:val="fr-CA"/>
-        </w:rPr>
-        <w:t xml:space="preserve"> </w:t>
-      </w:r>
-      <w:proofErr w:type="spellStart"/>
-      <w:r>
-        <w:rPr>
-          <w:rStyle w:val="HTMLCode"/>
-          <w:rFonts w:asciiTheme="majorHAnsi" w:hAnsiTheme="majorHAnsi" w:cstheme="majorHAnsi"/>
-          <w:i/>
-          <w:iCs/>
-          <w:sz w:val="22"/>
-          <w:szCs w:val="22"/>
-          <w:lang w:val="fr-CA"/>
-        </w:rPr>
-        <w:t>openvla</w:t>
-      </w:r>
-      <w:proofErr w:type="spellEnd"/>
-    </w:p>
-    <w:p>
-      <w:pPr>
-        <w:pStyle w:val="Heading2"/>
-        <w:spacing w:before="0" w:line="240" w:lineRule="auto"/>
-        <w:rPr>
-          <w:rFonts w:cstheme="majorHAnsi"/>
-          <w:sz w:val="22"/>
-          <w:szCs w:val="22"/>
-          <w:lang w:val="fr-CA"/>
-        </w:rPr>
-      </w:pPr>
-      <w:r>
-        <w:rPr>
-          <w:rStyle w:val="Strong"/>
-          <w:rFonts w:cstheme="majorHAnsi"/>
-          <w:b/>
-          <w:bCs/>
-          <w:sz w:val="22"/>
-          <w:szCs w:val="22"/>
-          <w:lang w:val="fr-CA"/>
-        </w:rPr>
-        <w:t>5) Installer les dépendances</w:t>
-      </w:r>
-    </w:p>
-    <w:p>
-      <w:pPr>
-        <w:pStyle w:val="HTMLPreformatted"/>
-        <w:jc w:val="right"/>
-        <w:rPr>
-          <w:rStyle w:val="HTMLCode"/>
-          <w:rFonts w:asciiTheme="majorHAnsi" w:hAnsiTheme="majorHAnsi" w:cstheme="majorHAnsi"/>
-          <w:sz w:val="22"/>
-          <w:szCs w:val="22"/>
-          <w:lang w:val="fr-CA"/>
-        </w:rPr>
-      </w:pPr>
-      <w:r>
-        <w:rPr>
-          <w:rStyle w:val="HTMLCode"/>
-          <w:rFonts w:asciiTheme="majorHAnsi" w:hAnsiTheme="majorHAnsi" w:cstheme="majorHAnsi"/>
-          <w:sz w:val="22"/>
-          <w:szCs w:val="22"/>
-          <w:lang w:val="fr-CA"/>
-        </w:rPr>
-        <w:tab/>
-      </w:r>
-      <w:proofErr w:type="spellStart"/>
-      <w:proofErr w:type="gramStart"/>
-      <w:r>
-        <w:rPr>
-          <w:rStyle w:val="HTMLCode"/>
-          <w:rFonts w:asciiTheme="majorHAnsi" w:hAnsiTheme="majorHAnsi" w:cstheme="majorHAnsi"/>
-          <w:sz w:val="22"/>
-          <w:szCs w:val="22"/>
-          <w:lang w:val="fr-CA"/>
-        </w:rPr>
-        <w:t>pip</w:t>
-      </w:r>
-      <w:proofErr w:type="spellEnd"/>
-      <w:proofErr w:type="gramEnd"/>
-      <w:r>
-        <w:rPr>
-          <w:rStyle w:val="HTMLCode"/>
-          <w:rFonts w:asciiTheme="majorHAnsi" w:hAnsiTheme="majorHAnsi" w:cstheme="majorHAnsi"/>
-          <w:sz w:val="22"/>
-          <w:szCs w:val="22"/>
-          <w:lang w:val="fr-CA"/>
-        </w:rPr>
-        <w:t xml:space="preserve"> </w:t>
-      </w:r>
-      <w:proofErr w:type="spellStart"/>
-      <w:r>
-        <w:rPr>
-          <w:rStyle w:val="HTMLCode"/>
-          <w:rFonts w:asciiTheme="majorHAnsi" w:hAnsiTheme="majorHAnsi" w:cstheme="majorHAnsi"/>
-          <w:sz w:val="22"/>
-          <w:szCs w:val="22"/>
-          <w:lang w:val="fr-CA"/>
-        </w:rPr>
-        <w:t>install</w:t>
-      </w:r>
-      <w:proofErr w:type="spellEnd"/>
-      <w:r>
-        <w:rPr>
-          <w:rStyle w:val="HTMLCode"/>
-          <w:rFonts w:asciiTheme="majorHAnsi" w:hAnsiTheme="majorHAnsi" w:cstheme="majorHAnsi"/>
-          <w:sz w:val="22"/>
-          <w:szCs w:val="22"/>
-          <w:lang w:val="fr-CA"/>
-        </w:rPr>
-        <w:t xml:space="preserve"> -r requirements.txt</w:t>
+        <w:t>Zivid SDK installé (Zivid Studio + pilotes Ethernet).</w:t>
       </w:r>
     </w:p>
     <w:p>
       <w:pPr>
         <w:pStyle w:val="Heading2"/>
-        <w:spacing w:before="0" w:line="240" w:lineRule="auto"/>
-        <w:rPr>
-          <w:rFonts w:cstheme="majorHAnsi"/>
-          <w:sz w:val="22"/>
-          <w:szCs w:val="22"/>
-          <w:lang w:val="fr-CA"/>
-        </w:rPr>
       </w:pPr>
       <w:r>
-        <w:rPr>
-          <w:rStyle w:val="Strong"/>
-          <w:rFonts w:cstheme="majorHAnsi"/>
-          <w:b/>
-          <w:bCs/>
-          <w:sz w:val="22"/>
-          <w:szCs w:val="22"/>
-          <w:lang w:val="fr-CA"/>
-        </w:rPr>
-        <w:t>6) Télécharger les modèles en FP16</w:t>
+        <w:t>2) Créer l'environnement Conda</w:t>
       </w:r>
     </w:p>
     <w:p>
-      <w:pPr>
-        <w:pStyle w:val="NormalWeb"/>
-        <w:spacing w:before="0" w:beforeAutospacing="0"/>
-        <w:rPr>
-          <w:rFonts w:asciiTheme="majorHAnsi" w:hAnsiTheme="majorHAnsi" w:cstheme="majorHAnsi"/>
-          <w:sz w:val="22"/>
-          <w:szCs w:val="22"/>
-          <w:lang w:val="fr-CA"/>
-        </w:rPr>
-      </w:pPr>
       <w:r>
         <w:rPr>
-          <w:rStyle w:val="Emphasis"/>
-          <w:rFonts w:asciiTheme="majorHAnsi" w:hAnsiTheme="majorHAnsi" w:cstheme="majorHAnsi"/>
-          <w:sz w:val="22"/>
-          <w:szCs w:val="22"/>
-          <w:lang w:val="fr-CA"/>
+          <w:rFonts w:ascii="Consolas" w:hAnsi="Consolas"/>
+          <w:sz w:val="18"/>
         </w:rPr>
-        <w:t>(FP16 est le mode standard, rien à configurer)</w:t>
+        <w:t>conda create -n env_openvla python=3.11 -y</w:t>
       </w:r>
     </w:p>
     <w:p>
-      <w:pPr>
-        <w:pStyle w:val="HTMLPreformatted"/>
-        <w:jc w:val="right"/>
-        <w:rPr>
-          <w:rStyle w:val="HTMLCode"/>
-          <w:rFonts w:asciiTheme="majorHAnsi" w:hAnsiTheme="majorHAnsi" w:cstheme="majorHAnsi"/>
-          <w:i/>
-          <w:iCs/>
-          <w:sz w:val="22"/>
-          <w:szCs w:val="22"/>
-        </w:rPr>
-      </w:pPr>
       <w:r>
         <w:rPr>
-          <w:rStyle w:val="HTMLCode"/>
-          <w:rFonts w:asciiTheme="majorHAnsi" w:hAnsiTheme="majorHAnsi" w:cstheme="majorHAnsi"/>
-          <w:i/>
-          <w:iCs/>
-          <w:sz w:val="22"/>
-          <w:szCs w:val="22"/>
+          <w:rFonts w:ascii="Consolas" w:hAnsi="Consolas"/>
+          <w:sz w:val="18"/>
         </w:rPr>
-        <w:t>python scripts/download_models.py --precision fp16</w:t>
+        <w:t>conda activate env_openvla</w:t>
+      </w:r>
+    </w:p>
+    <w:p>
+      <w:r>
+        <w:rPr>
+          <w:rFonts w:ascii="Consolas" w:hAnsi="Consolas"/>
+          <w:sz w:val="18"/>
+        </w:rPr>
+        <w:t>conda install -c conda-forge cmake -y</w:t>
       </w:r>
     </w:p>
     <w:p>
       <w:pPr>
         <w:pStyle w:val="Heading2"/>
-        <w:spacing w:before="0" w:line="240" w:lineRule="auto"/>
-        <w:rPr>
-          <w:rFonts w:cstheme="majorHAnsi"/>
-          <w:sz w:val="22"/>
-          <w:szCs w:val="22"/>
-          <w:lang w:val="fr-CA"/>
-        </w:rPr>
       </w:pPr>
       <w:r>
-        <w:rPr>
-          <w:rStyle w:val="Strong"/>
-          <w:rFonts w:cstheme="majorHAnsi"/>
-          <w:b/>
-          <w:bCs/>
-          <w:sz w:val="22"/>
-          <w:szCs w:val="22"/>
-          <w:lang w:val="fr-CA"/>
-        </w:rPr>
-        <w:t xml:space="preserve">7) Ajouter le support </w:t>
+        <w:t>3) Installer les dépendances Python</w:t>
       </w:r>
-      <w:proofErr w:type="spellStart"/>
-      <w:r>
-        <w:rPr>
-          <w:rStyle w:val="Strong"/>
-          <w:rFonts w:cstheme="majorHAnsi"/>
-          <w:b/>
-          <w:bCs/>
-          <w:sz w:val="22"/>
-          <w:szCs w:val="22"/>
-          <w:lang w:val="fr-CA"/>
-        </w:rPr>
-        <w:t>Zivid</w:t>
-      </w:r>
-      <w:proofErr w:type="spellEnd"/>
     </w:p>
     <w:p>
       <w:pPr>
-        <w:pStyle w:val="HTMLPreformatted"/>
-        <w:jc w:val="right"/>
-        <w:rPr>
-          <w:rStyle w:val="HTMLCode"/>
-          <w:rFonts w:asciiTheme="majorHAnsi" w:hAnsiTheme="majorHAnsi" w:cstheme="majorHAnsi"/>
-          <w:i/>
-          <w:iCs/>
-          <w:sz w:val="22"/>
-          <w:szCs w:val="22"/>
-        </w:rPr>
+        <w:pStyle w:val="ListBullet"/>
       </w:pPr>
-      <w:proofErr w:type="spellStart"/>
       <w:r>
-        <w:rPr>
-          <w:rStyle w:val="HTMLCode"/>
-          <w:rFonts w:asciiTheme="majorHAnsi" w:hAnsiTheme="majorHAnsi" w:cstheme="majorHAnsi"/>
-          <w:i/>
-          <w:iCs/>
-          <w:sz w:val="22"/>
-          <w:szCs w:val="22"/>
-        </w:rPr>
-        <w:t>sudo</w:t>
+        <w:t>Packages de base : numpy, opencv-python, scipy, Pillow.</w:t>
       </w:r>
-      <w:proofErr w:type="spellEnd"/>
-      <w:r>
-        <w:rPr>
-          <w:rStyle w:val="HTMLCode"/>
-          <w:rFonts w:asciiTheme="majorHAnsi" w:hAnsiTheme="majorHAnsi" w:cstheme="majorHAnsi"/>
-          <w:i/>
-          <w:iCs/>
-          <w:sz w:val="22"/>
-          <w:szCs w:val="22"/>
-        </w:rPr>
-        <w:t xml:space="preserve"> apt install -y </w:t>
-      </w:r>
-      <w:proofErr w:type="spellStart"/>
-      <w:r>
-        <w:rPr>
-          <w:rStyle w:val="HTMLCode"/>
-          <w:rFonts w:asciiTheme="majorHAnsi" w:hAnsiTheme="majorHAnsi" w:cstheme="majorHAnsi"/>
-          <w:i/>
-          <w:iCs/>
-          <w:sz w:val="22"/>
-          <w:szCs w:val="22"/>
-        </w:rPr>
-        <w:t>zivid-sdk</w:t>
-      </w:r>
-      <w:proofErr w:type="spellEnd"/>
     </w:p>
     <w:p>
       <w:pPr>
-        <w:pStyle w:val="HTMLPreformatted"/>
-        <w:jc w:val="right"/>
-        <w:rPr>
-          <w:rStyle w:val="HTMLCode"/>
-          <w:rFonts w:asciiTheme="majorHAnsi" w:hAnsiTheme="majorHAnsi" w:cstheme="majorHAnsi"/>
-          <w:i/>
-          <w:iCs/>
-          <w:sz w:val="22"/>
-          <w:szCs w:val="22"/>
-        </w:rPr>
+        <w:pStyle w:val="ListBullet"/>
       </w:pPr>
       <w:r>
-        <w:rPr>
-          <w:rStyle w:val="HTMLCode"/>
-          <w:rFonts w:asciiTheme="majorHAnsi" w:hAnsiTheme="majorHAnsi" w:cstheme="majorHAnsi"/>
-          <w:i/>
-          <w:iCs/>
-          <w:sz w:val="22"/>
-          <w:szCs w:val="22"/>
-        </w:rPr>
-        <w:t xml:space="preserve">pip install </w:t>
+        <w:t>Robot et caméra : ur_rtde, zivid.</w:t>
       </w:r>
-      <w:proofErr w:type="spellStart"/>
+    </w:p>
+    <w:p>
+      <w:pPr>
+        <w:pStyle w:val="ListBullet"/>
+      </w:pPr>
+      <w:r>
+        <w:t>Hugging Face : huggingface_hub, accelerate.</w:t>
+      </w:r>
+    </w:p>
+    <w:p>
+      <w:pPr>
+        <w:pStyle w:val="ListBullet"/>
+      </w:pPr>
+      <w:r>
+        <w:t>OpenVLA impose transformers==4.40.1 (version figée).</w:t>
+      </w:r>
+    </w:p>
+    <w:p>
+      <w:pPr>
+        <w:pStyle w:val="ListBullet"/>
+      </w:pPr>
+      <w:r>
+        <w:t>Visualisation 3D (optionnel) : open3d.</w:t>
+      </w:r>
+    </w:p>
+    <w:p>
       <w:r>
         <w:rPr>
-          <w:rStyle w:val="HTMLCode"/>
-          <w:rFonts w:asciiTheme="majorHAnsi" w:hAnsiTheme="majorHAnsi" w:cstheme="majorHAnsi"/>
-          <w:i/>
-          <w:iCs/>
-          <w:sz w:val="22"/>
-          <w:szCs w:val="22"/>
+          <w:rFonts w:ascii="Consolas" w:hAnsi="Consolas"/>
+          <w:sz w:val="18"/>
         </w:rPr>
-        <w:t>zivid</w:t>
+        <w:t>pip install numpy opencv-python scipy pillow</w:t>
       </w:r>
-      <w:proofErr w:type="spellEnd"/>
+    </w:p>
+    <w:p>
+      <w:r>
+        <w:rPr>
+          <w:rFonts w:ascii="Consolas" w:hAnsi="Consolas"/>
+          <w:sz w:val="18"/>
+        </w:rPr>
+        <w:t>pip install ur_rtde zivid huggingface_hub accelerate open3d</w:t>
+      </w:r>
+    </w:p>
+    <w:p>
+      <w:r>
+        <w:rPr>
+          <w:rFonts w:ascii="Consolas" w:hAnsi="Consolas"/>
+          <w:sz w:val="18"/>
+        </w:rPr>
+        <w:t>pip install transformers==4.40.1</w:t>
+      </w:r>
     </w:p>
     <w:p>
       <w:pPr>
         <w:pStyle w:val="Heading2"/>
-        <w:spacing w:before="0" w:line="240" w:lineRule="auto"/>
-        <w:rPr>
-          <w:rFonts w:cstheme="majorHAnsi"/>
-          <w:sz w:val="22"/>
-          <w:szCs w:val="22"/>
-        </w:rPr>
       </w:pPr>
       <w:r>
-        <w:rPr>
-          <w:rStyle w:val="Strong"/>
-          <w:rFonts w:cstheme="majorHAnsi"/>
-          <w:b/>
-          <w:bCs/>
-          <w:sz w:val="22"/>
-          <w:szCs w:val="22"/>
-        </w:rPr>
-        <w:t xml:space="preserve">8) Tester </w:t>
-      </w:r>
-      <w:proofErr w:type="spellStart"/>
-      <w:r>
-        <w:rPr>
-          <w:rStyle w:val="Strong"/>
-          <w:rFonts w:cstheme="majorHAnsi"/>
-          <w:b/>
-          <w:bCs/>
-          <w:sz w:val="22"/>
-          <w:szCs w:val="22"/>
-        </w:rPr>
-        <w:t>OpenVLA</w:t>
-      </w:r>
-      <w:proofErr w:type="spellEnd"/>
-    </w:p>
-    <w:p>
-      <w:pPr>
-        <w:pStyle w:val="HTMLPreformatted"/>
-        <w:jc w:val="right"/>
-        <w:rPr>
-          <w:rStyle w:val="HTMLCode"/>
-          <w:rFonts w:asciiTheme="majorHAnsi" w:hAnsiTheme="majorHAnsi" w:cstheme="majorHAnsi"/>
-          <w:i/>
-          <w:iCs/>
-          <w:sz w:val="22"/>
-          <w:szCs w:val="22"/>
-        </w:rPr>
-      </w:pPr>
-      <w:r>
-        <w:rPr>
-          <w:rStyle w:val="HTMLCode"/>
-          <w:rFonts w:asciiTheme="majorHAnsi" w:hAnsiTheme="majorHAnsi" w:cstheme="majorHAnsi"/>
-          <w:i/>
-          <w:iCs/>
-          <w:sz w:val="22"/>
-          <w:szCs w:val="22"/>
-        </w:rPr>
-        <w:t>python run_openvla.py \</w:t>
+        <w:t>4) Installer PyTorch GPU (CUDA)</w:t>
       </w:r>
     </w:p>
     <w:p>
       <w:pPr>
-        <w:pStyle w:val="HTMLPreformatted"/>
-        <w:jc w:val="right"/>
-        <w:rPr>
-          <w:rStyle w:val="HTMLCode"/>
-          <w:rFonts w:asciiTheme="majorHAnsi" w:hAnsiTheme="majorHAnsi" w:cstheme="majorHAnsi"/>
-          <w:i/>
-          <w:iCs/>
-          <w:sz w:val="22"/>
-          <w:szCs w:val="22"/>
-        </w:rPr>
+        <w:pStyle w:val="ListBullet"/>
       </w:pPr>
       <w:r>
+        <w:t>Vérifier que le GPU est détecté :</w:t>
+      </w:r>
+    </w:p>
+    <w:p>
+      <w:r>
         <w:rPr>
-          <w:rStyle w:val="HTMLCode"/>
-          <w:rFonts w:asciiTheme="majorHAnsi" w:hAnsiTheme="majorHAnsi" w:cstheme="majorHAnsi"/>
-          <w:i/>
-          <w:iCs/>
-          <w:sz w:val="22"/>
-          <w:szCs w:val="22"/>
+          <w:rFonts w:ascii="Consolas" w:hAnsi="Consolas"/>
+          <w:sz w:val="18"/>
         </w:rPr>
-        <w:t xml:space="preserve">  --image test.png \</w:t>
+        <w:t>python -c "import torch; print(torch.cuda.is_available(), torch.cuda.get_device_name(0))"</w:t>
       </w:r>
     </w:p>
     <w:p>
       <w:pPr>
-        <w:pStyle w:val="HTMLPreformatted"/>
-        <w:jc w:val="right"/>
-        <w:rPr>
-          <w:rStyle w:val="HTMLCode"/>
-          <w:rFonts w:asciiTheme="majorHAnsi" w:hAnsiTheme="majorHAnsi" w:cstheme="majorHAnsi"/>
-          <w:i/>
-          <w:iCs/>
-          <w:sz w:val="22"/>
-          <w:szCs w:val="22"/>
-        </w:rPr>
+        <w:pStyle w:val="ListBullet"/>
       </w:pPr>
       <w:r>
-        <w:rPr>
-          <w:rStyle w:val="HTMLCode"/>
-          <w:rFonts w:asciiTheme="majorHAnsi" w:hAnsiTheme="majorHAnsi" w:cstheme="majorHAnsi"/>
-          <w:i/>
-          <w:iCs/>
-          <w:sz w:val="22"/>
-          <w:szCs w:val="22"/>
-        </w:rPr>
-        <w:t xml:space="preserve">  --text "</w:t>
+        <w:t>Si échec (ex. RTX 5090 / architecture Blackwell sm_120), utiliser PyTorch nightly CUDA 12.8 :</w:t>
       </w:r>
-      <w:proofErr w:type="spellStart"/>
+    </w:p>
+    <w:p>
       <w:r>
         <w:rPr>
-          <w:rStyle w:val="HTMLCode"/>
-          <w:rFonts w:asciiTheme="majorHAnsi" w:hAnsiTheme="majorHAnsi" w:cstheme="majorHAnsi"/>
-          <w:i/>
-          <w:iCs/>
-          <w:sz w:val="22"/>
-          <w:szCs w:val="22"/>
+          <w:rFonts w:ascii="Consolas" w:hAnsi="Consolas"/>
+          <w:sz w:val="18"/>
         </w:rPr>
-        <w:t>Ramasse</w:t>
+        <w:t>pip uninstall torch torchvision torchaudio -y</w:t>
       </w:r>
-      <w:proofErr w:type="spellEnd"/>
+    </w:p>
+    <w:p>
       <w:r>
         <w:rPr>
-          <w:rStyle w:val="HTMLCode"/>
-          <w:rFonts w:asciiTheme="majorHAnsi" w:hAnsiTheme="majorHAnsi" w:cstheme="majorHAnsi"/>
-          <w:i/>
-          <w:iCs/>
-          <w:sz w:val="22"/>
-          <w:szCs w:val="22"/>
+          <w:rFonts w:ascii="Consolas" w:hAnsi="Consolas"/>
+          <w:sz w:val="18"/>
         </w:rPr>
-        <w:t xml:space="preserve"> le cube rouge." \</w:t>
+        <w:t>pip install --pre torch torchvision torchaudio --index-url https://download.pytorch.org/whl/nightly/cu128</w:t>
+      </w:r>
+    </w:p>
+    <w:p>
+      <w:r>
+        <w:rPr>
+          <w:rFonts w:ascii="Consolas" w:hAnsi="Consolas"/>
+          <w:sz w:val="18"/>
+        </w:rPr>
+        <w:t>pip install transformers==4.40.1 --force-reinstall</w:t>
       </w:r>
     </w:p>
     <w:p>
       <w:pPr>
-        <w:pStyle w:val="HTMLPreformatted"/>
-        <w:jc w:val="right"/>
-        <w:rPr>
-          <w:rStyle w:val="HTMLCode"/>
-          <w:rFonts w:asciiTheme="majorHAnsi" w:hAnsiTheme="majorHAnsi" w:cstheme="majorHAnsi"/>
-          <w:i/>
-          <w:iCs/>
-          <w:sz w:val="22"/>
-          <w:szCs w:val="22"/>
-        </w:rPr>
+        <w:pStyle w:val="Heading2"/>
       </w:pPr>
       <w:r>
-        <w:rPr>
-          <w:rStyle w:val="HTMLCode"/>
-          <w:rFonts w:asciiTheme="majorHAnsi" w:hAnsiTheme="majorHAnsi" w:cstheme="majorHAnsi"/>
-          <w:i/>
-          <w:iCs/>
-          <w:sz w:val="22"/>
-          <w:szCs w:val="22"/>
-        </w:rPr>
-        <w:t xml:space="preserve">  --precision fp16</w:t>
+        <w:t>5) Télécharger le modèle openvla-7b</w:t>
       </w:r>
     </w:p>
     <w:p>
       <w:pPr>
-        <w:jc w:val="both"/>
+        <w:pStyle w:val="ListBullet"/>
+      </w:pPr>
+      <w:r>
+        <w:t>Créer un compte Hugging Face et générer un token.</w:t>
+      </w:r>
+    </w:p>
+    <w:p>
+      <w:pPr>
+        <w:pStyle w:val="ListBullet"/>
+      </w:pPr>
+      <w:r>
+        <w:t>Se connecter puis télécharger le modèle en local :</w:t>
+      </w:r>
+    </w:p>
+    <w:p>
+      <w:r>
         <w:rPr>
-          <w:rFonts w:asciiTheme="majorHAnsi" w:hAnsiTheme="majorHAnsi" w:cstheme="majorHAnsi"/>
-          <w:lang w:val="fr-CA"/>
+          <w:rFonts w:ascii="Consolas" w:hAnsi="Consolas"/>
+          <w:sz w:val="18"/>
         </w:rPr>
+        <w:t>hf auth login</w:t>
+      </w:r>
+    </w:p>
+    <w:p>
+      <w:r>
+        <w:rPr>
+          <w:rFonts w:ascii="Consolas" w:hAnsi="Consolas"/>
+          <w:sz w:val="18"/>
+        </w:rPr>
+        <w:t>huggingface-cli download openvla/openvla-7b --local-dir C:\Users\Etudiant\models\openvla-7b</w:t>
+      </w:r>
+    </w:p>
+    <w:p>
+      <w:pPr>
+        <w:pStyle w:val="Heading2"/>
       </w:pPr>
+      <w:r>
+        <w:t>6) Test 1 — Chargement du modèle en VRAM</w:t>
+      </w:r>
+    </w:p>
+    <w:p>
+      <w:pPr>
+        <w:pStyle w:val="ListBullet"/>
+      </w:pPr>
+      <w:r>
+        <w:t>Script : scripts/integration/test/test_openvla.py</w:t>
+      </w:r>
+    </w:p>
+    <w:p>
+      <w:pPr>
+        <w:pStyle w:val="ListBullet"/>
+      </w:pPr>
+      <w:r>
+        <w:t>Résultat attendu : processor chargé, modèle sur cuda:0, ~15 Go VRAM (FP16).</w:t>
+      </w:r>
+    </w:p>
+    <w:p>
+      <w:pPr>
+        <w:pStyle w:val="Heading2"/>
+      </w:pPr>
+      <w:r>
+        <w:t>7) Test 2 — Capture Zivid + inférence OpenVLA</w:t>
+      </w:r>
+    </w:p>
+    <w:p>
+      <w:pPr>
+        <w:pStyle w:val="ListBullet"/>
+      </w:pPr>
+      <w:r>
+        <w:t>Script : scripts/integration/test/test_zivid_openvla.py</w:t>
+      </w:r>
+    </w:p>
+    <w:p>
+      <w:pPr>
+        <w:pStyle w:val="ListBullet"/>
+      </w:pPr>
+      <w:r>
+        <w:t>Pipeline : capture 2D/3D → conversion RGBA → RGB 224×224 → predict_action.</w:t>
+      </w:r>
+    </w:p>
+    <w:p>
+      <w:pPr>
+        <w:pStyle w:val="ListBullet"/>
+      </w:pPr>
+      <w:r>
+        <w:t>Sortie : 7 valeurs (dx, dy, dz, rx, ry, rz, pince).</w:t>
+      </w:r>
+    </w:p>
+    <w:p>
+      <w:pPr>
+        <w:pStyle w:val="Heading2"/>
+      </w:pPr>
+      <w:r>
+        <w:t>Ressources utiles</w:t>
+      </w:r>
+    </w:p>
+    <w:p>
+      <w:pPr>
+        <w:pStyle w:val="ListBullet"/>
+      </w:pPr>
+      <w:r>
+        <w:t>OpenVLA : https://openvla.github.io/</w:t>
+      </w:r>
+    </w:p>
+    <w:p>
+      <w:pPr>
+        <w:pStyle w:val="ListBullet"/>
+      </w:pPr>
+      <w:r>
+        <w:t>Installation : https://deepwiki.com/openvla/openvla/2-installation-and-setup</w:t>
+      </w:r>
+    </w:p>
+    <w:p>
+      <w:pPr>
+        <w:pStyle w:val="ListBullet"/>
+      </w:pPr>
+      <w:r>
+        <w:t>Zivid SDK : https://www.zivid.com/zivid-sdk</w:t>
+      </w:r>
+    </w:p>
+    <w:p>
+      <w:pPr>
+        <w:pStyle w:val="ListBullet"/>
+      </w:pPr>
+      <w:r>
+        <w:t>Notes détaillées du poste : scripts/utils.txt</w:t>
+      </w:r>
+    </w:p>
+    <w:p/>
+    <w:p>
+      <w:r>
+        <w:t>Mise à jour installation — Windows 11 Pro | Projet OpenVLA — Stage CCNB-INNOV | Mai 2026</w:t>
+      </w:r>
     </w:p>
     <w:sectPr>
       <w:pgSz w:w="12240" w:h="15840"/>

</xml_diff>